<commit_message>
Rescore 6sense application with corrected Level Agency programmatic deals
Score corrected from 18/100 to 43/100 (likely-not-a-fit -> long shot)
after Josh corrected the master profile: 2 personally-closed programmatic
advertising deals at Level Agency, ~$30K MRR each (~$360K ACV per
client), not the $20K-45K one-time figures the first pass assumed.
Resume and cover letter rebuilt to lead with this evidence. Real gaps
remain (no overlay selling, no hands-on DSP execution, Fortune-500 tier
of the 2 clients unconfirmed) and are stated plainly in the match report.

Co-Authored-By: Claude Sonnet 5 <noreply@anthropic.com>
Claude-Session: https://claude.ai/code/session_01GBXQWKH1sNQEs3FfVfDvYc
</commit_message>
<xml_diff>
--- a/applications/6sense-strategic-advertising-account-executive/6sense-StrategicAdvertisingAE-CoverLetter.docx
+++ b/applications/6sense-strategic-advertising-account-executive/6sense-StrategicAdvertisingAE-CoverLetter.docx
@@ -94,7 +94,7 @@
           <w:b w:val="0"/>
           <w:color w:val="1A1A1A"/>
         </w:rPr>
-        <w:t>6sense is looking for someone who can sell complex, high-value opportunities and hold their own with senior stakeholders. Over 15 years in B2B sales, I have built a track record of doing exactly that at the scale I have operated in: full-cycle ownership, consistent quota over-attainment, and trusted relationships with the people who sign off on the deal.</w:t>
+        <w:t>6sense needs someone who can sell complex, high-value advertising opportunities and hold their own with senior stakeholders. At Level Agency, I personally sold and closed 2 programmatic advertising accounts at roughly $30,000 in monthly recurring revenue each, about $360,000 in annual contract value per client, owning the relationship and strategy while a specialist team executed the buys.</w:t>
       </w:r>
     </w:p>
     <w:p>
@@ -107,7 +107,7 @@
           <w:b w:val="0"/>
           <w:color w:val="1A1A1A"/>
         </w:rPr>
-        <w:t>At Accelo, I ranked top three in sales on a team that grew from 8 to 15 reps, holding that rank through a 27-month tenure while quota roughly doubled, consistently performing above commission floor into accelerator tiers on roughly $213K in annualized bookings. At Wix, I onboarded and launched 25+ clients a month at 120% of sales targets and 110% of implementation targets. Across Accelo, Wix, and Fetch &amp; Funnel, I built relationships with C-suite buyers as a trusted advisor on operational and revenue systems, the same credibility this role needs with CMOs and senior marketing leaders.</w:t>
+        <w:t>That deal-closing discipline runs through my whole career. At Accelo, I ranked top three in sales on a team that grew from 8 to 15 reps, holding that rank through a 27-month tenure while quota roughly doubled, consistently performing above commission floor into accelerator tiers. At Wix, I onboarded and launched 25+ clients a month at 120% of sales targets and 110% of implementation targets. Across Accelo, Wix, and Level Agency, I built relationships with the executives who sign off on the deal, the same credibility this role needs with CMOs and senior marketing leaders.</w:t>
       </w:r>
     </w:p>
     <w:p>
@@ -120,7 +120,7 @@
           <w:b w:val="0"/>
           <w:color w:val="1A1A1A"/>
         </w:rPr>
-        <w:t>My deal sizes and account scale to date have been mid-market rather than enterprise, and programmatic advertising specifically is new ground for me, but the discipline that gets a rep to the top of the leaderboard, consistent execution, real relationships, and translating capability into business outcomes, does not change with the size of the account. I would welcome the chance to talk through how that track record applies to 6sense's enterprise motion.</w:t>
+        <w:t>My account base to date has been mid-market rather than Fortune 500, and I have sold programmatic rather than executed it hands-on in a DSP, but I know what it takes to close a six-figure annual contract and keep the relationship afterward. I would welcome the chance to talk through how that applies to 6sense's enterprise motion.</w:t>
       </w:r>
     </w:p>
     <w:p>

</xml_diff>